<commit_message>
Apply P3 audit fixes; rebuild P3 decks and printed set
Co-Authored-By: Claude Sonnet 5.5 <noreply@anthropic.com>
Claude-Session: https://claude.ai/code/session_01NYgB3ju57UwWRpkPPM6X7F
</commit_message>
<xml_diff>
--- a/p3/P3_Holiday_Program_Guide.docx
+++ b/p3/P3_Holiday_Program_Guide.docx
@@ -5145,7 +5145,7 @@
                 <w:sz w:val="20"/>
                 <w:szCs w:val="20"/>
               </w:rPr>
-              <w:t xml:space="preserve">Tutor builds the bars on a shared slide. Each child uses Lego bricks, coins or paper strips at home, and a whiteboard or paper to draw bars.</w:t>
+              <w:t xml:space="preserve">Tutor builds the bars on a shared slide. Each child uses Lego bricks, coins or paper strips at home, and a whiteboard or paper to draw bars. Print the workbook before the lesson. Pairs work in one breakout room for 10 minutes, then return for the check slide.</w:t>
             </w:r>
           </w:p>
         </w:tc>
@@ -5284,7 +5284,7 @@
                 <w:sz w:val="20"/>
                 <w:szCs w:val="20"/>
               </w:rPr>
-              <w:t xml:space="preserve">Children use 25 small things at home (dried beans, buttons, LEGO bricks) and a few cups or bowls. Share the screen for the slides; children hold whiteboards up to the camera.</w:t>
+              <w:t xml:space="preserve">Children use 25 small things at home (dried beans, buttons, LEGO bricks) and a few cups or bowls. Share the screen for the slides; children hold whiteboards up to the camera. Print the workbook before the lesson. Pairs work in one breakout room for 10 minutes, then return for the check slide.</w:t>
             </w:r>
           </w:p>
         </w:tc>
@@ -5390,7 +5390,7 @@
                 <w:sz w:val="20"/>
                 <w:szCs w:val="20"/>
               </w:rPr>
-              <w:t xml:space="preserve">7 paper strips per child, all the same length (24 cm works well), ruler, coloured pencils, scissors, mini whiteboards.</w:t>
+              <w:t xml:space="preserve">The printed fraction strip page (7 strips per child, all the same length, 24 cm), coloured pencils, scissors, mini whiteboards.</w:t>
             </w:r>
           </w:p>
         </w:tc>
@@ -5423,7 +5423,7 @@
                 <w:sz w:val="20"/>
                 <w:szCs w:val="20"/>
               </w:rPr>
-              <w:t xml:space="preserve">Children cut seven 24 cm strips from A4 paper before the lesson (or print the fraction strip page). Marks every 12, 8, 6, 4, 3 and 2 cm give halves, thirds, quarters, sixths, eighths and twelfths. Share the screen for the slides.</w:t>
+              <w:t xml:space="preserve">Send the printed fraction strip page instead of asking children to measure and cut strips. Marks every 12, 8, 6, 4, 3 and 2 cm give halves, thirds, quarters, sixths, eighths and twelfths. Share the screen for the slides. Print the workbook before the lesson. Pairs work in one breakout room for 10 minutes, then return for the check slide.</w:t>
             </w:r>
           </w:p>
         </w:tc>
@@ -5701,7 +5701,7 @@
                 <w:sz w:val="20"/>
                 <w:szCs w:val="20"/>
               </w:rPr>
-              <w:t xml:space="preserve">Each child folds a right-angle checker on camera and goes on a 2-minute right-angle hunt at home; the tutor shares the grid slides to draw on.</w:t>
+              <w:t xml:space="preserve">Each child folds a right-angle checker on camera and goes on a 2-minute right-angle hunt at home; the tutor shares the grid slides to draw on. Print the workbook before the lesson. Pairs work in one breakout room for 10 minutes, then return for the check slide.</w:t>
             </w:r>
           </w:p>
         </w:tc>
@@ -5946,7 +5946,7 @@
                 <w:sz w:val="20"/>
                 <w:szCs w:val="20"/>
               </w:rPr>
-              <w:t xml:space="preserve">Puzzle cards for 4 stations (graph, logic, list, measure), digit cards 0 to 9, a 1 m 20 cm string, play money, squared paper, mini whiteboards, certificates, stamps.</w:t>
+              <w:t xml:space="preserve">Puzzle cards for 2 stations (list, measure), digit cards 0 to 9 (or paper cards), squared paper, mini whiteboards, certificates, stamps.</w:t>
             </w:r>
           </w:p>
         </w:tc>
@@ -5979,7 +5979,7 @@
                 <w:sz w:val="20"/>
                 <w:szCs w:val="20"/>
               </w:rPr>
-              <w:t xml:space="preserve">Each breakout pair gets one station card on screen and reports back; logic grids and graphs are shared on screen and annotated together.</w:t>
+              <w:t xml:space="preserve">Two stations, 7 minutes each. Pairs stay in one breakout room, and the tutor shares the next station card when the timer ends. No physical materials beyond paper. Logic grids and graphs are shared on screen and annotated together.</w:t>
             </w:r>
           </w:p>
         </w:tc>
@@ -18927,7 +18927,7 @@
           <w:sz w:val="20"/>
           <w:szCs w:val="20"/>
         </w:rPr>
-        <w:t xml:space="preserve">Table: 7, 4, 1, 8, 5, 2, 9, 6, 3, 0 (from 7, 14, 21, 28, 35, 42, 49, 56, 63, 70): all ten digits, each once  (a) 3 and 9 (the 3s: 3, 6, 9, 2, 5, 8, 1, 4, 7, 0; the 9s: 9, 8, 7 … 0). Tables 2, 4, 6, 8 give only even last digits; the 5s give only 5 and 0.  (b) 2, because 7 × 6 = 42 (7 × 46 = 322).</w:t>
+        <w:t xml:space="preserve">Table: 7, 4, 1, 8, 5, 2, 9, 6, 3, 0 (from 7, 14, 21, 28, 35, 42, 49, 56, 63, 70): all ten digits, each once  (a) 3 and 9 (the 3s: 3, 6, 9, 2, 5, 8, 1, 4, 7, 0; the 9s: 9, 8, 7 … 0). The 6s give only even last digits (and the 2s, 4s and 8s do too); the 5s give only 5 and 0.  (b) 2, because 7 × 6 = 42 (7 × 46 = 322).</w:t>
       </w:r>
     </w:p>
     <w:p>
@@ -19371,7 +19371,7 @@
                 <w:sz w:val="20"/>
                 <w:szCs w:val="20"/>
               </w:rPr>
-              <w:t xml:space="preserve">Tutor builds the bars on a shared slide. Each child uses Lego bricks, coins or paper strips at home, and a whiteboard or paper to draw bars.</w:t>
+              <w:t xml:space="preserve">Tutor builds the bars on a shared slide. Each child uses Lego bricks, coins or paper strips at home, and a whiteboard or paper to draw bars. Print the workbook before the lesson. Pairs work in one breakout room for 10 minutes, then return for the check slide.</w:t>
             </w:r>
           </w:p>
         </w:tc>
@@ -22026,7 +22026,7 @@
                 <w:sz w:val="20"/>
                 <w:szCs w:val="20"/>
               </w:rPr>
-              <w:t xml:space="preserve">Workbook Think Harder 4: Mei is 8 years old. Her mother is 36. How old will Mei be when her mother is 3 times as old as Mei?</w:t>
+              <w:t xml:space="preserve">Workbook Think Harder 4: A bag of rice and a bag of flour weigh 9 kg altogether. The rice is 3 kg heavier than the flour. How heavy is each bag?</w:t>
             </w:r>
           </w:p>
         </w:tc>
@@ -22059,7 +22059,7 @@
                 <w:sz w:val="20"/>
                 <w:szCs w:val="20"/>
               </w:rPr>
-              <w:t xml:space="preserve">14. The difference, 28 years, never changes. Mother 3 units, Mei 1 unit, so 2 units = 28 and Mei is 14 (mother 42).</w:t>
+              <w:t xml:space="preserve">Flour 3 kg, rice 6 kg (9 − 3 = 6, 6 ÷ 2 = 3).</w:t>
             </w:r>
           </w:p>
         </w:tc>
@@ -22168,7 +22168,7 @@
                 <w:sz w:val="20"/>
                 <w:szCs w:val="20"/>
               </w:rPr>
-              <w:t xml:space="preserve">Workbook Challenge 6: Ali has $60 more than Ben. Ali spends $15 and Ben spends $35. Now Ali has 5 times as much money as Ben. How much money did Ben have at first?</w:t>
+              <w:t xml:space="preserve">Workbook Challenge 6: A pen costs $3 more than a ruler. Mei buys 2 pens and 2 rulers for $18. How much does one pen cost?</w:t>
             </w:r>
           </w:p>
         </w:tc>
@@ -22201,7 +22201,7 @@
                 <w:sz w:val="20"/>
                 <w:szCs w:val="20"/>
               </w:rPr>
-              <w:t xml:space="preserve">$55. The difference grows to $60 + $20 = $80 = 4 units, so Ben now has $20 and had $55 (Ali had $115).</w:t>
+              <w:t xml:space="preserve">$6. 2 pens and 2 rulers is 2 pairs, so one pen and one ruler cost $9. The pen is $3 more, so take away $3: $6 is 2 equal parts, a ruler costs $3 and a pen costs $6. Check: 2 × 6 + 2 × 3 = 18.</w:t>
             </w:r>
           </w:p>
         </w:tc>
@@ -23084,7 +23084,7 @@
           <w:sz w:val="20"/>
           <w:szCs w:val="20"/>
         </w:rPr>
-        <w:t xml:space="preserve">(a) The difference: $45 − $18 = $27 stays the same  (b) After: Ali 2 units, Ben 1 unit, so 1 unit = $27. Ben now has $27, so Grandma gave each boy $27 − $18 = $9. Check: $54 = 2 × $27.</w:t>
+        <w:t xml:space="preserve">(a) $27 (Ali $55, Ben $28)  (b) $27  (c) The difference stays the same, because both boys got the same amount.</w:t>
       </w:r>
     </w:p>
     <w:p>
@@ -23428,7 +23428,7 @@
                 <w:sz w:val="20"/>
                 <w:szCs w:val="20"/>
               </w:rPr>
-              <w:t xml:space="preserve">Children use 25 small things at home (dried beans, buttons, LEGO bricks) and a few cups or bowls. Share the screen for the slides; children hold whiteboards up to the camera.</w:t>
+              <w:t xml:space="preserve">Children use 25 small things at home (dried beans, buttons, LEGO bricks) and a few cups or bowls. Share the screen for the slides; children hold whiteboards up to the camera. Print the workbook before the lesson. Pairs work in one breakout room for 10 minutes, then return for the check slide.</w:t>
             </w:r>
           </w:p>
         </w:tc>
@@ -26083,7 +26083,7 @@
                 <w:sz w:val="20"/>
                 <w:szCs w:val="20"/>
               </w:rPr>
-              <w:t xml:space="preserve">Workbook Think Harder 4: A boat can carry 9 people. 100 people want to cross the river. How many trips must the boat make?</w:t>
+              <w:t xml:space="preserve">Workbook Think Harder 4: A boat can carry 9 people at a time. 100 people want to cross the river. How many boatloads are needed?</w:t>
             </w:r>
           </w:p>
         </w:tc>
@@ -26116,7 +26116,7 @@
                 <w:sz w:val="20"/>
                 <w:szCs w:val="20"/>
               </w:rPr>
-              <w:t xml:space="preserve">12 trips (100 ÷ 9 = 11 r 1; the last person needs a trip too)</w:t>
+              <w:t xml:space="preserve">12 boatloads (100 ÷ 9 = 11 r 1; the last person needs a boatload too)</w:t>
             </w:r>
           </w:p>
         </w:tc>
@@ -27411,7 +27411,7 @@
                 <w:sz w:val="20"/>
                 <w:szCs w:val="20"/>
               </w:rPr>
-              <w:t xml:space="preserve">7 paper strips per child, all the same length (24 cm works well), ruler, coloured pencils, scissors, mini whiteboards.</w:t>
+              <w:t xml:space="preserve">The printed fraction strip page (7 strips per child, all the same length, 24 cm), coloured pencils, scissors, mini whiteboards.</w:t>
             </w:r>
           </w:p>
         </w:tc>
@@ -27485,7 +27485,7 @@
                 <w:sz w:val="20"/>
                 <w:szCs w:val="20"/>
               </w:rPr>
-              <w:t xml:space="preserve">Children cut seven 24 cm strips from A4 paper before the lesson (or print the fraction strip page). Marks every 12, 8, 6, 4, 3 and 2 cm give halves, thirds, quarters, sixths, eighths and twelfths. Share the screen for the slides.</w:t>
+              <w:t xml:space="preserve">Send the printed fraction strip page instead of asking children to measure and cut strips. Marks every 12, 8, 6, 4, 3 and 2 cm give halves, thirds, quarters, sixths, eighths and twelfths. Share the screen for the slides. Print the workbook before the lesson. Pairs work in one breakout room for 10 minutes, then return for the check slide.</w:t>
             </w:r>
           </w:p>
         </w:tc>
@@ -35581,7 +35581,7 @@
                 <w:sz w:val="20"/>
                 <w:szCs w:val="20"/>
               </w:rPr>
-              <w:t xml:space="preserve">Each child folds a right-angle checker on camera and goes on a 2-minute right-angle hunt at home; the tutor shares the grid slides to draw on.</w:t>
+              <w:t xml:space="preserve">Each child folds a right-angle checker on camera and goes on a 2-minute right-angle hunt at home; the tutor shares the grid slides to draw on. Print the workbook before the lesson. Pairs work in one breakout room for 10 minutes, then return for the check slide.</w:t>
             </w:r>
           </w:p>
         </w:tc>
@@ -38193,7 +38193,7 @@
                 <w:sz w:val="20"/>
                 <w:szCs w:val="20"/>
               </w:rPr>
-              <w:t xml:space="preserve">Workbook Think Harder 4: The # sign is made of 4 lines. How many pairs of parallel lines does it have? How many pairs of perpendicular lines?</w:t>
+              <w:t xml:space="preserve">Workbook Think Harder 4: The # sign is made of 4 lines: 2 upright lines and 2 lines across. How many pairs of parallel lines does it have? How many pairs of perpendicular lines?</w:t>
             </w:r>
           </w:p>
         </w:tc>
@@ -38264,7 +38264,7 @@
                 <w:sz w:val="20"/>
                 <w:szCs w:val="20"/>
               </w:rPr>
-              <w:t xml:space="preserve">Workbook Challenge 5: A 4-sided shape has 3 right angles. What can you say about its 4th angle? Can a 5-sided shape have exactly 3 right angles? Draw one.</w:t>
+              <w:t xml:space="preserve">Workbook Challenge 5: A 4-sided shape has 3 right angles. Draw it. Test the 4th angle with your checker. Can a 5-sided shape have exactly 3 right angles? Draw one.</w:t>
             </w:r>
           </w:p>
         </w:tc>
@@ -38297,7 +38297,7 @@
                 <w:sz w:val="20"/>
                 <w:szCs w:val="20"/>
               </w:rPr>
-              <w:t xml:space="preserve">The 4th angle is a right angle too (the shape is a rectangle). Yes: cut one corner off a rectangle with one slanted cut.</w:t>
+              <w:t xml:space="preserve">The 4th angle is a right angle too (it is a rectangle). Yes: cut one corner off a rectangle with one slanted cut.</w:t>
             </w:r>
           </w:p>
         </w:tc>
@@ -38439,7 +38439,7 @@
                 <w:sz w:val="20"/>
                 <w:szCs w:val="20"/>
               </w:rPr>
-              <w:t xml:space="preserve">No. The most is 5, for example an L shape: walking round, the square corners all turn the same way, and 4 turns the same way bring you back to the start, so one corner of 6 must turn the other way (a dent).</w:t>
+              <w:t xml:space="preserve">No. The most is 5, for example an L shape. Children try to draw 6 square corners and always find a dent. A proof is not expected.</w:t>
             </w:r>
           </w:p>
         </w:tc>
@@ -40453,7 +40453,7 @@
           <w:sz w:val="21"/>
           <w:szCs w:val="21"/>
         </w:rPr>
-        <w:t xml:space="preserve">2. Each friend drinks 250 ml of punch. Buy enough punch.</w:t>
+        <w:t xml:space="preserve">2. Each friend drinks 250 ml of punch. Buy at least 2 ℓ of punch (any number of bottles).</w:t>
       </w:r>
     </w:p>
     <w:p>
@@ -40479,7 +40479,7 @@
           <w:sz w:val="21"/>
           <w:szCs w:val="21"/>
         </w:rPr>
-        <w:t xml:space="preserve">3. Buy at least one food. Spend as close to $20 as you can.</w:t>
+        <w:t xml:space="preserve">3. Buy at least one food. You may buy more than one of an item. Spend as close to $20 as you can.</w:t>
       </w:r>
     </w:p>
     <w:p>
@@ -40825,7 +40825,7 @@
                 <w:sz w:val="20"/>
                 <w:szCs w:val="20"/>
               </w:rPr>
-              <w:t xml:space="preserve">8 × 250 ml = 2000 ml = 2 ℓ, so 1 bottle.</w:t>
+              <w:t xml:space="preserve">8 × 250 ml = 2000 ml = 2 ℓ, so at least 1 bottle. You may buy more.</w:t>
             </w:r>
           </w:p>
         </w:tc>
@@ -42248,7 +42248,7 @@
                 <w:sz w:val="20"/>
                 <w:szCs w:val="20"/>
               </w:rPr>
-              <w:t xml:space="preserve">Workbook Think Harder 4: Ben has only 20¢ and 50¢ coins. He has 9 coins worth $3 altogether. How many of each coin does he have?</w:t>
+              <w:t xml:space="preserve">Workbook Think Harder 4: Buses leave the interchange every 25 minutes. The first bus leaves at 06:40. The ride to school takes 35 minutes. Ravi must reach school by 08:30. Which is the latest bus he can take?</w:t>
             </w:r>
           </w:p>
         </w:tc>
@@ -42281,7 +42281,7 @@
                 <w:sz w:val="20"/>
                 <w:szCs w:val="20"/>
               </w:rPr>
-              <w:t xml:space="preserve">Four 50¢ coins and five 20¢ coins ($2 + $1 = $3)</w:t>
+              <w:t xml:space="preserve">The 07:55 bus (buses: 06:40, 07:05, 07:30, 07:55, 08:20; 07:55 + 35 min = 08:30; the 08:20 bus arrives at 08:55, too late).</w:t>
             </w:r>
           </w:p>
         </w:tc>
@@ -42461,7 +42461,7 @@
                 <w:sz w:val="20"/>
                 <w:szCs w:val="20"/>
               </w:rPr>
-              <w:t xml:space="preserve">Workbook Challenge 7: A clock is 10 minutes fast. A train leaves when this clock shows 13:05. The trip takes 1 h 40 min. What is the real time when the train arrives? Give it in 24-hour and 12-hour time.</w:t>
+              <w:t xml:space="preserve">Workbook Challenge 7: The clock at the station is 10 minutes fast. The train leaves when this clock shows 13:05. The trip takes 1 h 40 min. What is the real (correct) time when the train arrives? Give it in 24-hour and 12-hour time.</w:t>
             </w:r>
           </w:p>
         </w:tc>
@@ -43181,7 +43181,7 @@
           <w:sz w:val="20"/>
           <w:szCs w:val="20"/>
         </w:rPr>
-        <w:t xml:space="preserve">(a) 306 cm  (b) 2450 g  (c) 4 ℓ 80 ml  (d) 175 cm + 85 cm = 260 cm = 2 m 60 cm</w:t>
+        <w:t xml:space="preserve">(a) 306 cm  (b) 2450 g  (c) 4 ℓ 80 ml  (d) 4 × 65 cm = 260 cm; 300 cm − 260 cm = 40 cm</w:t>
       </w:r>
     </w:p>
     <w:p>
@@ -43231,7 +43231,7 @@
           <w:sz w:val="20"/>
           <w:szCs w:val="20"/>
         </w:rPr>
-        <w:t xml:space="preserve">(a) 4 × 65 cm = 260 cm = 2 m 60 cm  (b) 300 cm − 260 cm = 40 cm  (c) No: 40 cm is less than 65 cm. She needs 25 cm more.</w:t>
+        <w:t xml:space="preserve">(a) No: $7.85 + $6.90 + $5.50 = $20.25, which is 25¢ more than $20.  (b, if time) Book, pen set and puzzle: $19.35. Change: 65¢.</w:t>
       </w:r>
     </w:p>
     <w:p>
@@ -43256,7 +43256,7 @@
           <w:sz w:val="20"/>
           <w:szCs w:val="20"/>
         </w:rPr>
-        <w:t xml:space="preserve">(a) No: $7.85 + $6.90 + $5.50 = $20.25, which is 25¢ more than $20.  (b) Book, pen set and puzzle: $19.35. Change: 65¢.</w:t>
+        <w:t xml:space="preserve">(a) 07:15, 15:40, 8:05 p.m., 12:30  (b) 17 − 12 = 5, so 17:00 is 5 p.m., not 7 p.m.</w:t>
       </w:r>
     </w:p>
     <w:p>
@@ -43281,7 +43281,7 @@
           <w:sz w:val="20"/>
           <w:szCs w:val="20"/>
         </w:rPr>
-        <w:t xml:space="preserve">(a) 07:15, 15:40, 8:05 p.m., 12:30  (b) 17 − 12 = 5, so 17:00 is 5 p.m., not 7 p.m.</w:t>
+        <w:t xml:space="preserve">(a) 1 h 25 min (15 min + 1 h + 10 min)  (b) 17:25  (c) 19:25 (21:15 back 15 min = 21:00, back 1 h = 20:00, back 35 min = 19:25)</w:t>
       </w:r>
     </w:p>
     <w:p>
@@ -43306,32 +43306,7 @@
           <w:sz w:val="20"/>
           <w:szCs w:val="20"/>
         </w:rPr>
-        <w:t xml:space="preserve">(a) 1 h 25 min (15 min + 1 h + 10 min)  (b) 17:25  (c) 19:25 (21:15 back 15 min = 21:00, back 1 h = 20:00, back 35 min = 19:25)</w:t>
-      </w:r>
-    </w:p>
-    <w:p>
-      <w:pPr>
-        <w:keepLines/>
-        <w:spacing w:after="50" w:before="0" w:line="270" w:lineRule="auto"/>
-        <w:ind w:left="240"/>
-      </w:pPr>
-      <w:r>
-        <w:rPr>
-          <w:rFonts w:ascii="Arial" w:cs="Arial" w:eastAsia="Arial" w:hAnsi="Arial"/>
-          <w:b/>
-          <w:bCs/>
-          <w:sz w:val="20"/>
-          <w:szCs w:val="20"/>
-        </w:rPr>
-        <w:t xml:space="preserve">Q7  </w:t>
-      </w:r>
-      <w:r>
-        <w:rPr>
-          <w:rFonts w:ascii="Arial" w:cs="Arial" w:eastAsia="Arial" w:hAnsi="Arial"/>
-          <w:sz w:val="20"/>
-          <w:szCs w:val="20"/>
-        </w:rPr>
-        <w:t xml:space="preserve">(a) Buses: 06:40, 07:05, 07:30, 07:55, 08:20. Next bus 08:20; he waits 5 minutes.  (b) 08:55  (c) The 07:55 bus (07:55 + 35 min = 08:30).</w:t>
+        <w:t xml:space="preserve">(if time) (a) Buses: 06:40, 07:05, 07:30, 07:55, 08:20. Next bus 08:20; he waits 5 minutes.  (b) 08:55</w:t>
       </w:r>
     </w:p>
     <w:p>
@@ -43601,7 +43576,7 @@
                 <w:sz w:val="20"/>
                 <w:szCs w:val="20"/>
               </w:rPr>
-              <w:t xml:space="preserve">Puzzle cards for 4 stations (graph, logic, list, measure), digit cards 0 to 9, a 1 m 20 cm string, play money, squared paper, mini whiteboards, certificates, stamps.</w:t>
+              <w:t xml:space="preserve">Puzzle cards for 2 stations (list, measure), digit cards 0 to 9 (or paper cards), squared paper, mini whiteboards, certificates, stamps.</w:t>
             </w:r>
           </w:p>
         </w:tc>
@@ -43675,7 +43650,7 @@
                 <w:sz w:val="20"/>
                 <w:szCs w:val="20"/>
               </w:rPr>
-              <w:t xml:space="preserve">Each breakout pair gets one station card on screen and reports back; logic grids and graphs are shared on screen and annotated together.</w:t>
+              <w:t xml:space="preserve">Two stations, 7 minutes each. Pairs stay in one breakout room, and the tutor shares the next station card when the timer ends. No physical materials beyond paper. Logic grids and graphs are shared on screen and annotated together.</w:t>
             </w:r>
           </w:p>
         </w:tc>
@@ -44481,7 +44456,7 @@
           <w:sz w:val="21"/>
           <w:szCs w:val="21"/>
         </w:rPr>
-        <w:t xml:space="preserve">“Look at the four stations. Which one do you think will be the hardest? Write your guess, and we will see at the end.”</w:t>
+        <w:t xml:space="preserve">“Look at the two stations. Which one do you think will be harder? Write your guess, and we will see at the end.”</w:t>
       </w:r>
     </w:p>
     <w:p>
@@ -44507,7 +44482,7 @@
           <w:sz w:val="21"/>
           <w:szCs w:val="21"/>
         </w:rPr>
-        <w:t xml:space="preserve">1. Pick 2 of the 4 stations: Graph, Logic, List, Measure.</w:t>
+        <w:t xml:space="preserve">1. Two stations, 7 minutes each: List, then Measure.</w:t>
       </w:r>
     </w:p>
     <w:p>
@@ -44665,7 +44640,7 @@
           <w:sz w:val="21"/>
           <w:szCs w:val="21"/>
         </w:rPr>
-        <w:t xml:space="preserve">Graph station: “What does one space on the scale stand for?”</w:t>
+        <w:t xml:space="preserve">List station: “Start with the smallest digit in the hundreds place. How many numbers does each digit give?”</w:t>
       </w:r>
     </w:p>
     <w:p>
@@ -44691,7 +44666,7 @@
           <w:sz w:val="21"/>
           <w:szCs w:val="21"/>
         </w:rPr>
-        <w:t xml:space="preserve">Logic station: “Find a clue that tells you something for sure. Put a cross where it cannot be.”</w:t>
+        <w:t xml:space="preserve">Measure station: “Draw the three pieces. What if all three were the same? What is extra?”</w:t>
       </w:r>
     </w:p>
     <w:p>
@@ -45014,7 +44989,7 @@
                 <w:sz w:val="20"/>
                 <w:szCs w:val="20"/>
               </w:rPr>
-              <w:t xml:space="preserve">Measure station: how long is each piece of string?</w:t>
+              <w:t xml:space="preserve">Measure station: how long is each piece of ribbon?</w:t>
             </w:r>
           </w:p>
         </w:tc>

</xml_diff>